<commit_message>
Update Windows WHID valuation and timing workflow
</commit_message>
<xml_diff>
--- a/Stock_price_prediction/WHID第二階段_指標定義與判讀速查.docx
+++ b/Stock_price_prediction/WHID第二階段_指標定義與判讀速查.docx
@@ -876,17 +876,332 @@
     </w:tbl>
     <w:p>
       <w:pPr>
-        <w:keepNext w:val="0"/>
-        <w:spacing w:before="0" w:after="0" w:line="240" w:lineRule="auto"/>
+        <w:keepNext/>
+        <w:spacing w:before="100" w:after="40" w:line="240" w:lineRule="auto"/>
       </w:pPr>
       <w:r>
         <w:rPr>
           <w:rFonts w:ascii="Microsoft JhengHei" w:hAnsi="Microsoft JhengHei" w:eastAsia="Microsoft JhengHei"/>
           <w:b/>
           <w:color w:val="17365D"/>
-          <w:sz w:val="16"/>
+          <w:sz w:val="23"/>
         </w:rPr>
-        <w:t>讀表原則：短、長期趨勢、籌碼K線與指數成分先作研究說明；現行交易建議仍由中期趨勢＋外資投信＋風險門檻形成。</w:t>
+        <w:t>5　市場情緒、融資壓力與新聞研究</w:t>
+      </w:r>
+    </w:p>
+    <w:tbl>
+      <w:tblPr>
+        <w:tblStyle w:val="TableGrid"/>
+        <w:tblW w:type="dxa" w:w="9360"/>
+        <w:jc w:val="left"/>
+        <w:tblLayout w:type="fixed"/>
+        <w:tblLook w:firstColumn="1" w:firstRow="1" w:lastColumn="0" w:lastRow="0" w:noHBand="0" w:noVBand="1" w:val="04A0"/>
+        <w:tblInd w:w="120" w:type="dxa"/>
+      </w:tblPr>
+      <w:tblGrid>
+        <w:gridCol w:w="900"/>
+        <w:gridCol w:w="2260"/>
+        <w:gridCol w:w="4000"/>
+        <w:gridCol w:w="2200"/>
+      </w:tblGrid>
+      <w:tr>
+        <w:trPr>
+          <w:tblHeader/>
+        </w:trPr>
+        <w:tc>
+          <w:tcPr>
+            <w:tcW w:type="dxa" w:w="900"/>
+            <w:vAlign w:val="center"/>
+            <w:tcMar>
+              <w:top w:w="55" w:type="dxa"/>
+              <w:start w:w="80" w:type="dxa"/>
+              <w:bottom w:w="55" w:type="dxa"/>
+              <w:end w:w="80" w:type="dxa"/>
+            </w:tcMar>
+            <w:shd w:fill="17365D"/>
+          </w:tcPr>
+          <w:p>
+            <w:r>
+              <w:t>指標</w:t>
+            </w:r>
+          </w:p>
+        </w:tc>
+        <w:tc>
+          <w:tcPr>
+            <w:tcW w:type="dxa" w:w="2260"/>
+            <w:vAlign w:val="center"/>
+            <w:tcMar>
+              <w:top w:w="55" w:type="dxa"/>
+              <w:start w:w="80" w:type="dxa"/>
+              <w:bottom w:w="55" w:type="dxa"/>
+              <w:end w:w="80" w:type="dxa"/>
+            </w:tcMar>
+            <w:shd w:fill="17365D"/>
+          </w:tcPr>
+          <w:p>
+            <w:r>
+              <w:t>判讀定義</w:t>
+            </w:r>
+          </w:p>
+        </w:tc>
+        <w:tc>
+          <w:tcPr>
+            <w:tcW w:type="dxa" w:w="4000"/>
+            <w:vAlign w:val="center"/>
+            <w:tcMar>
+              <w:top w:w="55" w:type="dxa"/>
+              <w:start w:w="80" w:type="dxa"/>
+              <w:bottom w:w="55" w:type="dxa"/>
+              <w:end w:w="80" w:type="dxa"/>
+            </w:tcMar>
+            <w:shd w:fill="17365D"/>
+          </w:tcPr>
+          <w:p>
+            <w:r>
+              <w:t>資料來源</w:t>
+            </w:r>
+          </w:p>
+        </w:tc>
+        <w:tc>
+          <w:tcPr>
+            <w:tcW w:type="dxa" w:w="2200"/>
+            <w:vAlign w:val="center"/>
+            <w:tcMar>
+              <w:top w:w="55" w:type="dxa"/>
+              <w:start w:w="80" w:type="dxa"/>
+              <w:bottom w:w="55" w:type="dxa"/>
+              <w:end w:w="80" w:type="dxa"/>
+            </w:tcMar>
+            <w:shd w:fill="17365D"/>
+          </w:tcPr>
+          <w:p>
+            <w:r>
+              <w:t>目前用途</w:t>
+            </w:r>
+          </w:p>
+        </w:tc>
+      </w:tr>
+      <w:tr>
+        <w:tc>
+          <w:tcPr>
+            <w:tcW w:type="dxa" w:w="900"/>
+            <w:vAlign w:val="center"/>
+            <w:tcMar>
+              <w:top w:w="55" w:type="dxa"/>
+              <w:start w:w="80" w:type="dxa"/>
+              <w:bottom w:w="55" w:type="dxa"/>
+              <w:end w:w="80" w:type="dxa"/>
+            </w:tcMar>
+            <w:shd w:fill="E8EEF5"/>
+          </w:tcPr>
+          <w:p>
+            <w:r>
+              <w:t>市場情緒</w:t>
+            </w:r>
+          </w:p>
+        </w:tc>
+        <w:tc>
+          <w:tcPr>
+            <w:tcW w:type="dxa" w:w="2260"/>
+            <w:vAlign w:val="center"/>
+            <w:tcMar>
+              <w:top w:w="55" w:type="dxa"/>
+              <w:start w:w="80" w:type="dxa"/>
+              <w:bottom w:w="55" w:type="dxa"/>
+              <w:end w:w="80" w:type="dxa"/>
+            </w:tcMar>
+          </w:tcPr>
+          <w:p>
+            <w:r>
+              <w:t>TW：TAIEX 20日報酬、60日線與大盤融資金額。US：SPY 20日報酬、60日線、VIX水準與20日變化。形成0–100分。</w:t>
+            </w:r>
+          </w:p>
+        </w:tc>
+        <w:tc>
+          <w:tcPr>
+            <w:tcW w:type="dxa" w:w="4000"/>
+            <w:vAlign w:val="center"/>
+            <w:tcMar>
+              <w:top w:w="55" w:type="dxa"/>
+              <w:start w:w="80" w:type="dxa"/>
+              <w:bottom w:w="55" w:type="dxa"/>
+              <w:end w:w="80" w:type="dxa"/>
+            </w:tcMar>
+          </w:tcPr>
+          <w:p>
+            <w:r>
+              <w:t>TW FinMind；US Yahoo</w:t>
+            </w:r>
+          </w:p>
+        </w:tc>
+        <w:tc>
+          <w:tcPr>
+            <w:tcW w:type="dxa" w:w="2200"/>
+            <w:vAlign w:val="center"/>
+            <w:tcMar>
+              <w:top w:w="55" w:type="dxa"/>
+              <w:start w:w="80" w:type="dxa"/>
+              <w:bottom w:w="55" w:type="dxa"/>
+              <w:end w:w="80" w:type="dxa"/>
+            </w:tcMar>
+          </w:tcPr>
+          <w:p>
+            <w:r>
+              <w:t>65以上偏多、35以下偏空；僅研究參考。</w:t>
+            </w:r>
+          </w:p>
+        </w:tc>
+      </w:tr>
+      <w:tr>
+        <w:tc>
+          <w:tcPr>
+            <w:tcW w:type="dxa" w:w="900"/>
+            <w:vAlign w:val="center"/>
+            <w:tcMar>
+              <w:top w:w="55" w:type="dxa"/>
+              <w:start w:w="80" w:type="dxa"/>
+              <w:bottom w:w="55" w:type="dxa"/>
+              <w:end w:w="80" w:type="dxa"/>
+            </w:tcMar>
+            <w:shd w:fill="E8EEF5"/>
+          </w:tcPr>
+          <w:p>
+            <w:r>
+              <w:t>個股情緒／融資壓力</w:t>
+            </w:r>
+          </w:p>
+        </w:tc>
+        <w:tc>
+          <w:tcPr>
+            <w:tcW w:type="dxa" w:w="2260"/>
+            <w:vAlign w:val="center"/>
+            <w:tcMar>
+              <w:top w:w="55" w:type="dxa"/>
+              <w:start w:w="80" w:type="dxa"/>
+              <w:bottom w:w="55" w:type="dxa"/>
+              <w:end w:w="80" w:type="dxa"/>
+            </w:tcMar>
+          </w:tcPr>
+          <w:p>
+            <w:r>
+              <w:t>TW以籌碼K線、中期趨勢、RSI形成個股情緒，並以融資近5日變化、過熱及限額使用率標示壓力。US以CMF、帶方向成交量、趨勢及相對SPY報酬形成。</w:t>
+            </w:r>
+          </w:p>
+        </w:tc>
+        <w:tc>
+          <w:tcPr>
+            <w:tcW w:type="dxa" w:w="4000"/>
+            <w:vAlign w:val="center"/>
+            <w:tcMar>
+              <w:top w:w="55" w:type="dxa"/>
+              <w:start w:w="80" w:type="dxa"/>
+              <w:bottom w:w="55" w:type="dxa"/>
+              <w:end w:w="80" w:type="dxa"/>
+            </w:tcMar>
+          </w:tcPr>
+          <w:p>
+            <w:r>
+              <w:t>TW FinMind；US Yahoo</w:t>
+            </w:r>
+          </w:p>
+        </w:tc>
+        <w:tc>
+          <w:tcPr>
+            <w:tcW w:type="dxa" w:w="2200"/>
+            <w:vAlign w:val="center"/>
+            <w:tcMar>
+              <w:top w:w="55" w:type="dxa"/>
+              <w:start w:w="80" w:type="dxa"/>
+              <w:bottom w:w="55" w:type="dxa"/>
+              <w:end w:w="80" w:type="dxa"/>
+            </w:tcMar>
+          </w:tcPr>
+          <w:p>
+            <w:r>
+              <w:t>不改交易建議。公開資料不能還原實際融資維持率。</w:t>
+            </w:r>
+          </w:p>
+        </w:tc>
+      </w:tr>
+      <w:tr>
+        <w:tc>
+          <w:tcPr>
+            <w:tcW w:type="dxa" w:w="900"/>
+            <w:vAlign w:val="center"/>
+            <w:tcMar>
+              <w:top w:w="55" w:type="dxa"/>
+              <w:start w:w="80" w:type="dxa"/>
+              <w:bottom w:w="55" w:type="dxa"/>
+              <w:end w:w="80" w:type="dxa"/>
+            </w:tcMar>
+            <w:shd w:fill="E8EEF5"/>
+          </w:tcPr>
+          <w:p>
+            <w:r>
+              <w:t>新聞情緒</w:t>
+            </w:r>
+          </w:p>
+        </w:tc>
+        <w:tc>
+          <w:tcPr>
+            <w:tcW w:type="dxa" w:w="2260"/>
+            <w:vAlign w:val="center"/>
+            <w:tcMar>
+              <w:top w:w="55" w:type="dxa"/>
+              <w:start w:w="80" w:type="dxa"/>
+              <w:bottom w:w="55" w:type="dxa"/>
+              <w:end w:w="80" w:type="dxa"/>
+            </w:tcMar>
+          </w:tcPr>
+          <w:p>
+            <w:r>
+              <w:t>Yahoo近期標題／摘要以透明關鍵字分類，優先統計相關代號包含該股的文章；逐篇保存來源、時間、網址、相關性與分數。</w:t>
+            </w:r>
+          </w:p>
+        </w:tc>
+        <w:tc>
+          <w:tcPr>
+            <w:tcW w:type="dxa" w:w="4000"/>
+            <w:vAlign w:val="center"/>
+            <w:tcMar>
+              <w:top w:w="55" w:type="dxa"/>
+              <w:start w:w="80" w:type="dxa"/>
+              <w:bottom w:w="55" w:type="dxa"/>
+              <w:end w:w="80" w:type="dxa"/>
+            </w:tcMar>
+          </w:tcPr>
+          <w:p>
+            <w:r>
+              <w:t>Yahoo Finance</w:t>
+            </w:r>
+          </w:p>
+        </w:tc>
+        <w:tc>
+          <w:tcPr>
+            <w:tcW w:type="dxa" w:w="2200"/>
+            <w:vAlign w:val="center"/>
+            <w:tcMar>
+              <w:top w:w="55" w:type="dxa"/>
+              <w:start w:w="80" w:type="dxa"/>
+              <w:bottom w:w="55" w:type="dxa"/>
+              <w:end w:w="80" w:type="dxa"/>
+            </w:tcMar>
+          </w:tcPr>
+          <w:p>
+            <w:r>
+              <w:t>每日封存，30日後以個股報酬減同期TAIEX／SPY報酬驗證；目前不視為因果或AI特徵。</w:t>
+            </w:r>
+          </w:p>
+        </w:tc>
+      </w:tr>
+    </w:tbl>
+    <w:p>
+      <w:pPr>
+        <w:keepNext w:val="0"/>
+        <w:spacing w:before="0" w:after="0" w:line="240" w:lineRule="auto"/>
+      </w:pPr>
+      <w:r>
+        <w:t>讀表原則：短、長期趨勢、籌碼K線、市場／個股／新聞情緒與融資壓力先作研究說明；現行交易建議仍由中期趨勢＋既有籌碼／量價＋風險門檻形成。新增欄位需累積樣本後再決定是否調整。</w:t>
       </w:r>
     </w:p>
     <w:sectPr>

</xml_diff>